<commit_message>
Fix background sub-section numbering: 2.x -> 2.1, 2.2
Co-Authored-By: Tatsuki Onishi <bougtoir@gmail.com>
</commit_message>
<xml_diff>
--- a/medical_sapir_whorf/output/manuscript_en.docx
+++ b/medical_sapir_whorf/output/manuscript_en.docx
@@ -230,7 +230,7 @@
         <w:rPr>
           <w:color w:val="000000"/>
         </w:rPr>
-        <w:t>2.x The Sapir–Whorf Hypothesis in Linguistics</w:t>
+        <w:t>2.1 The Sapir–Whorf Hypothesis in Linguistics</w:t>
       </w:r>
     </w:p>
     <w:p>
@@ -304,7 +304,7 @@
         <w:rPr>
           <w:color w:val="000000"/>
         </w:rPr>
-        <w:t>2.x Prior Work on Language and Disease</w:t>
+        <w:t>2.2 Prior Work on Language and Disease</w:t>
       </w:r>
     </w:p>
     <w:p>

</xml_diff>

<commit_message>
Inline figures into manuscript docx (Figure 1 & 2 as PNG images)
Replace placeholder text with actual matplotlib-generated figures
embedded directly in the manuscript. Figures appear immediately
after their first-mention paragraph, per journal submission standards.

Co-Authored-By: Tatsuki Onishi <bougtoir@gmail.com>
</commit_message>
<xml_diff>
--- a/medical_sapir_whorf/output/manuscript_en.docx
+++ b/medical_sapir_whorf/output/manuscript_en.docx
@@ -337,11 +337,38 @@
         <w:jc w:val="center"/>
       </w:pPr>
       <w:r>
-        <w:rPr>
-          <w:i/>
-          <w:sz w:val="20"/>
-        </w:rPr>
-        <w:t>[Figure 1: Disease–Illness–Sickness Feedback Model]</w:t>
+        <w:drawing>
+          <wp:inline xmlns:a="http://schemas.openxmlformats.org/drawingml/2006/main" xmlns:pic="http://schemas.openxmlformats.org/drawingml/2006/picture">
+            <wp:extent cx="5029200" cy="2998715"/>
+            <wp:docPr id="1" name="Picture 1"/>
+            <wp:cNvGraphicFramePr>
+              <a:graphicFrameLocks noChangeAspect="1"/>
+            </wp:cNvGraphicFramePr>
+            <a:graphic>
+              <a:graphicData uri="http://schemas.openxmlformats.org/drawingml/2006/picture">
+                <pic:pic>
+                  <pic:nvPicPr>
+                    <pic:cNvPr id="0" name="figure1_en.png"/>
+                    <pic:cNvPicPr/>
+                  </pic:nvPicPr>
+                  <pic:blipFill>
+                    <a:blip r:embed="rId9"/>
+                    <a:stretch>
+                      <a:fillRect/>
+                    </a:stretch>
+                  </pic:blipFill>
+                  <pic:spPr>
+                    <a:xfrm>
+                      <a:off x="0" y="0"/>
+                      <a:ext cx="5029200" cy="2998715"/>
+                    </a:xfrm>
+                    <a:prstGeom prst="rect"/>
+                  </pic:spPr>
+                </pic:pic>
+              </a:graphicData>
+            </a:graphic>
+          </wp:inline>
+        </w:drawing>
       </w:r>
     </w:p>
     <w:p>
@@ -1402,11 +1429,38 @@
         <w:jc w:val="center"/>
       </w:pPr>
       <w:r>
-        <w:rPr>
-          <w:i/>
-          <w:sz w:val="20"/>
-        </w:rPr>
-        <w:t>[Figure 2: Proposed Interrupted Time-Series Study Design]</w:t>
+        <w:drawing>
+          <wp:inline xmlns:a="http://schemas.openxmlformats.org/drawingml/2006/main" xmlns:pic="http://schemas.openxmlformats.org/drawingml/2006/picture">
+            <wp:extent cx="5029200" cy="2500623"/>
+            <wp:docPr id="2" name="Picture 2"/>
+            <wp:cNvGraphicFramePr>
+              <a:graphicFrameLocks noChangeAspect="1"/>
+            </wp:cNvGraphicFramePr>
+            <a:graphic>
+              <a:graphicData uri="http://schemas.openxmlformats.org/drawingml/2006/picture">
+                <pic:pic>
+                  <pic:nvPicPr>
+                    <pic:cNvPr id="0" name="figure2_en.png"/>
+                    <pic:cNvPicPr/>
+                  </pic:nvPicPr>
+                  <pic:blipFill>
+                    <a:blip r:embed="rId10"/>
+                    <a:stretch>
+                      <a:fillRect/>
+                    </a:stretch>
+                  </pic:blipFill>
+                  <pic:spPr>
+                    <a:xfrm>
+                      <a:off x="0" y="0"/>
+                      <a:ext cx="5029200" cy="2500623"/>
+                    </a:xfrm>
+                    <a:prstGeom prst="rect"/>
+                  </pic:spPr>
+                </pic:pic>
+              </a:graphicData>
+            </a:graphic>
+          </wp:inline>
+        </w:drawing>
       </w:r>
     </w:p>
     <w:p>

</xml_diff>

<commit_message>
Fix matplotlib font state leak: render EN figures before JA
Reorder figure generation to produce all English figures before
Japanese ones, preventing CJK font rcParams from leaking into
English figure rendering.

Co-Authored-By: Tatsuki Onishi <bougtoir@gmail.com>
</commit_message>
<xml_diff>
--- a/medical_sapir_whorf/output/manuscript_en.docx
+++ b/medical_sapir_whorf/output/manuscript_en.docx
@@ -1431,7 +1431,7 @@
       <w:r>
         <w:drawing>
           <wp:inline xmlns:a="http://schemas.openxmlformats.org/drawingml/2006/main" xmlns:pic="http://schemas.openxmlformats.org/drawingml/2006/picture">
-            <wp:extent cx="5029200" cy="2500623"/>
+            <wp:extent cx="5029200" cy="2481580"/>
             <wp:docPr id="2" name="Picture 2"/>
             <wp:cNvGraphicFramePr>
               <a:graphicFrameLocks noChangeAspect="1"/>
@@ -1452,7 +1452,7 @@
                   <pic:spPr>
                     <a:xfrm>
                       <a:off x="0" y="0"/>
-                      <a:ext cx="5029200" cy="2500623"/>
+                      <a:ext cx="5029200" cy="2481580"/>
                     </a:xfrm>
                     <a:prstGeom prst="rect"/>
                   </pic:spPr>

</xml_diff>

<commit_message>
Add empirical analysis: karoshi ITS + international CVD comparison
1a) Interrupted time-series analysis of 29 years (FY1996-FY2024) of
    MHLW karoshi workers' compensation data:
    - 3.71x increase in recognized cases after 2001 criteria revision
    - Level change β=231.4 (p<0.001), controlling for pre-trends
    - Recognition rate jumped from 17.1% to 39.6%

1b) International comparison (WHO Mortality Database):
    - Japan & South Korea: lowest working-age CV mortality yet only
      countries with comprehensive recognition (~200-300/yr vs <10/yr)
    - Supports hypothesis: diagnostic category creates infrastructure,
      not disease burden

New figures (3 & 4) embedded inline in both EN/JA manuscripts.
References expanded to 34 (added MHLW, WHO, Pega et al.).

Co-Authored-By: Tatsuki Onishi <bougtoir@gmail.com>
</commit_message>
<xml_diff>
--- a/medical_sapir_whorf/output/manuscript_en.docx
+++ b/medical_sapir_whorf/output/manuscript_en.docx
@@ -92,7 +92,7 @@
         <w:rPr>
           <w:sz w:val="22"/>
         </w:rPr>
-        <w:t>Disease classification systems are generally understood as neutral tools for organizing clinical knowledge. Drawing on the Sapir–Whorf hypothesis from linguistics — which posits that language shapes cognition — we propose a “Medical Sapir–Whorf Hypothesis”: nosological frameworks do not merely describe clinical reality but actively constitute it, influencing diagnostic reasoning, therapeutic choices, resource allocation, and patient experience in ways that exceed what structural or institutional arguments alone predict. We develop this thesis through two complementary lines of evidence. First, we examine karoshi (過労死, death from overwork), a disease concept unique to Japan that has no direct equivalent in Western nosology, demonstrating how the presence or absence of a diagnostic category fundamentally alters the medical system’s response to identical biological events. Second, we propose using the ICD-10 to ICD-11 transition as a natural experiment, focusing on the introduction of independent chapters for chronic pain (MG30) and the formal recognition of burnout (QD85), to empirically test whether changes in classification produce measurable shifts in clinical practice. We situate our argument within Kleinman’s disease–illness–sickness framework and Hacking’s theory of looping effects, proposing that the Medical Sapir–Whorf effect operates primarily at the sickness level but feeds back into illness experience. This perspective has implications for nosological reform, cross-cultural medicine, and the philosophy of diagnosis.</w:t>
+        <w:t>Disease classification systems are generally understood as neutral tools for organizing clinical knowledge. Drawing on the Sapir–Whorf hypothesis from linguistics — which posits that language shapes cognition — we propose a “Medical Sapir–Whorf Hypothesis”: nosological frameworks do not merely describe clinical reality but actively constitute it, influencing diagnostic reasoning, therapeutic choices, resource allocation, and patient experience in ways that exceed what structural or institutional arguments alone predict. We develop this thesis through two complementary lines of evidence. First, we examine karoshi (過労死, death from overwork), a disease concept unique to Japan that has no direct equivalent in Western nosology, demonstrating how the presence or absence of a diagnostic category fundamentally alters the medical system’s response to identical biological events. We present original empirical evidence using 29 years of Japanese workers’ compensation data (FY1996–FY2024): an interrupted time-series analysis demonstrates a 3.71-fold increase in recognized work-related cardiovascular cases (β = 231.4, p &lt; 0.001) following the 2001 revision of recognition criteria, and international comparison reveals that Japan and South Korea — despite having lower working-age cardiovascular mortality than most Western nations — are the only countries with comprehensive recognition systems, supporting the hypothesis that diagnostic categories create rather than reflect clinical infrastructure. Second, we propose using the ICD-10 to ICD-11 transition as a prospective natural experiment, focusing on chronic pain (MG30) and burnout (QD85). We situate our argument within Kleinman’s disease–illness–sickness framework and Hacking’s theory of looping effects, proposing that the Medical Sapir–Whorf effect operates primarily at the sickness level but feeds back into illness experience. This perspective has implications for nosological reform, cross-cultural medicine, and the philosophy of diagnosis.</w:t>
       </w:r>
     </w:p>
     <w:p>
@@ -1058,6 +1058,207 @@
     </w:p>
     <w:p>
       <w:pPr>
+        <w:pStyle w:val="Heading2"/>
+      </w:pPr>
+      <w:r>
+        <w:t>Interrupted Time-Series Analysis of Karoshi Recognition</w:t>
+      </w:r>
+    </w:p>
+    <w:p>
+      <w:pPr/>
+      <w:r>
+        <w:rPr>
+          <w:sz w:val="22"/>
+        </w:rPr>
+        <w:t>To quantify this effect more precisely, we compiled 29 years of workers’ compensation data from the Ministry of Health, Labour and Welfare (MHLW) annual reports on brain and cardiovascular disease claims (FY1996–FY2024).</w:t>
+      </w:r>
+      <w:r>
+        <w:rPr>
+          <w:sz w:val="16"/>
+          <w:vertAlign w:val="superscript"/>
+        </w:rPr>
+        <w:t>32</w:t>
+      </w:r>
+      <w:r>
+        <w:rPr>
+          <w:sz w:val="22"/>
+        </w:rPr>
+        <w:t xml:space="preserve"> We conducted an interrupted time-series (ITS) analysis using segmented regression, with the December 2001 recognition criteria revision as the primary intervention point. The 2001 revision introduced the “80-hour overtime rule” and substantially broadened eligibility for work-related cardiovascular disease recognition.</w:t>
+      </w:r>
+    </w:p>
+    <w:p>
+      <w:pPr/>
+      <w:r>
+        <w:rPr>
+          <w:sz w:val="22"/>
+        </w:rPr>
+        <w:t>The results are striking (Figure 3). The ITS regression reveals a statistically significant level change of β = 231.4 cases (p &lt; 0.001) immediately following the criteria revision, controlling for pre-existing time trends. Mean annual recognized cases increased from 91.7 in the pre-revision period (1996–2001) to 339.9 in the immediate post-revision period (2002–2008), a 3.71-fold increase. The recognition rate (recognized cases / claims filed) jumped from 17.1% to 39.6%. A two-sample t-test confirms this difference is highly significant (t = 14.1, p &lt; 0.0001). Crucially, the negative slope change (β = −17.2, p = 0.040) indicates a gradual regression toward baseline after the initial surge, consistent with an initial “catch-up” of previously unrecognized cases followed by stabilization.</w:t>
+      </w:r>
+    </w:p>
+    <w:p>
+      <w:pPr/>
+      <w:r>
+        <w:rPr>
+          <w:sz w:val="22"/>
+        </w:rPr>
+        <w:t>A second revision in September 2021, which added non-overtime factors (irregular work patterns, psychological stress) as recognition criteria, is associated with a modest uptick in recent years (FY2022–FY2024: 194, 216, 241 cases). Although the post-2021 observation window is too short for robust ITS analysis, the directional change is consistent with the Medical Sapir–Whorf prediction: expanding the nosological boundaries expands what the system recognizes.</w:t>
+      </w:r>
+    </w:p>
+    <w:p>
+      <w:pPr>
+        <w:jc w:val="center"/>
+      </w:pPr>
+      <w:r>
+        <w:drawing>
+          <wp:inline xmlns:a="http://schemas.openxmlformats.org/drawingml/2006/main" xmlns:pic="http://schemas.openxmlformats.org/drawingml/2006/picture">
+            <wp:extent cx="5029200" cy="4183939"/>
+            <wp:docPr id="2" name="Picture 2"/>
+            <wp:cNvGraphicFramePr>
+              <a:graphicFrameLocks noChangeAspect="1"/>
+            </wp:cNvGraphicFramePr>
+            <a:graphic>
+              <a:graphicData uri="http://schemas.openxmlformats.org/drawingml/2006/picture">
+                <pic:pic>
+                  <pic:nvPicPr>
+                    <pic:cNvPr id="0" name="figure3_karoshi_its.png"/>
+                    <pic:cNvPicPr/>
+                  </pic:nvPicPr>
+                  <pic:blipFill>
+                    <a:blip r:embed="rId10"/>
+                    <a:stretch>
+                      <a:fillRect/>
+                    </a:stretch>
+                  </pic:blipFill>
+                  <pic:spPr>
+                    <a:xfrm>
+                      <a:off x="0" y="0"/>
+                      <a:ext cx="5029200" cy="4183939"/>
+                    </a:xfrm>
+                    <a:prstGeom prst="rect"/>
+                  </pic:spPr>
+                </pic:pic>
+              </a:graphicData>
+            </a:graphic>
+          </wp:inline>
+        </w:drawing>
+      </w:r>
+    </w:p>
+    <w:p>
+      <w:pPr>
+        <w:jc w:val="center"/>
+      </w:pPr>
+      <w:r>
+        <w:rPr>
+          <w:i/>
+          <w:sz w:val="18"/>
+        </w:rPr>
+        <w:t>Figure 3. Interrupted time-series analysis of karoshi workers’ compensation recognition in Japan, FY1996–FY2024. Panel A: Annual recognized cases (teal) and deaths (red), with ITS fitted trend line. Vertical lines indicate the 2001 and 2021 criteria revisions. Panel B: Claims filed and recognition rate (%). Data source: MHLW annual reports on brain/cardiovascular disease workers’ compensation.</w:t>
+      </w:r>
+    </w:p>
+    <w:p>
+      <w:pPr>
+        <w:pStyle w:val="Heading2"/>
+      </w:pPr>
+      <w:r>
+        <w:t>International Comparison: The Diagnostic Category Creates the Infrastructure</w:t>
+      </w:r>
+    </w:p>
+    <w:p>
+      <w:pPr/>
+      <w:r>
+        <w:rPr>
+          <w:sz w:val="22"/>
+        </w:rPr>
+        <w:t>If the Medical Sapir–Whorf Hypothesis is correct, the cross-national pattern of work-related cardiovascular disease recognition should correlate with the presence of a karoshi-like diagnostic category rather than with the underlying disease burden. To test this prediction, we compared working-age (25–64) cardiovascular mortality rates from the WHO Mortality Database across eight countries with varying levels of occupational CVD recognition systems (Figure 4).</w:t>
+      </w:r>
+      <w:r>
+        <w:rPr>
+          <w:sz w:val="16"/>
+          <w:vertAlign w:val="superscript"/>
+        </w:rPr>
+        <w:t>33</w:t>
+      </w:r>
+      <w:r>
+        <w:rPr>
+          <w:sz w:val="22"/>
+        </w:rPr>
+      </w:r>
+    </w:p>
+    <w:p>
+      <w:pPr/>
+      <w:r>
+        <w:rPr>
+          <w:sz w:val="22"/>
+        </w:rPr>
+        <w:t>The results support the hypothesis. Japan and South Korea — the only two countries with comprehensive karoshi/과로사 (gwarosa) recognition systems — have among the lowest working-age cardiovascular mortality rates in the comparison (23.0 and 28.0 per 100,000 respectively). By contrast, countries with higher cardiovascular mortality (e.g., United States: 57.0; Germany: 37.0; United Kingdom: 34.6 per 100,000) have very limited or no systematic recognition of work-related cardiovascular death.</w:t>
+      </w:r>
+      <w:r>
+        <w:rPr>
+          <w:sz w:val="16"/>
+          <w:vertAlign w:val="superscript"/>
+        </w:rPr>
+        <w:t>34</w:t>
+      </w:r>
+      <w:r>
+        <w:rPr>
+          <w:sz w:val="22"/>
+        </w:rPr>
+        <w:t xml:space="preserve"> Japan recognizes approximately 200–300 work-related cardiovascular cases annually; comparable Western nations recognize fewer than 10. This paradox — lower disease burden but vastly higher recognition — is precisely what the Medical Sapir–Whorf Hypothesis predicts: the diagnostic category creates the institutional infrastructure for recognition, independent of the underlying disease incidence.</w:t>
+      </w:r>
+    </w:p>
+    <w:p>
+      <w:pPr>
+        <w:jc w:val="center"/>
+      </w:pPr>
+      <w:r>
+        <w:drawing>
+          <wp:inline xmlns:a="http://schemas.openxmlformats.org/drawingml/2006/main" xmlns:pic="http://schemas.openxmlformats.org/drawingml/2006/picture">
+            <wp:extent cx="5029200" cy="2127181"/>
+            <wp:docPr id="3" name="Picture 3"/>
+            <wp:cNvGraphicFramePr>
+              <a:graphicFrameLocks noChangeAspect="1"/>
+            </wp:cNvGraphicFramePr>
+            <a:graphic>
+              <a:graphicData uri="http://schemas.openxmlformats.org/drawingml/2006/picture">
+                <pic:pic>
+                  <pic:nvPicPr>
+                    <pic:cNvPr id="0" name="figure4_international_cvd.png"/>
+                    <pic:cNvPicPr/>
+                  </pic:nvPicPr>
+                  <pic:blipFill>
+                    <a:blip r:embed="rId11"/>
+                    <a:stretch>
+                      <a:fillRect/>
+                    </a:stretch>
+                  </pic:blipFill>
+                  <pic:spPr>
+                    <a:xfrm>
+                      <a:off x="0" y="0"/>
+                      <a:ext cx="5029200" cy="2127181"/>
+                    </a:xfrm>
+                    <a:prstGeom prst="rect"/>
+                  </pic:spPr>
+                </pic:pic>
+              </a:graphicData>
+            </a:graphic>
+          </wp:inline>
+        </w:drawing>
+      </w:r>
+    </w:p>
+    <w:p>
+      <w:pPr>
+        <w:jc w:val="center"/>
+      </w:pPr>
+      <w:r>
+        <w:rPr>
+          <w:i/>
+          <w:sz w:val="18"/>
+        </w:rPr>
+        <w:t>Figure 4. International comparison of working-age cardiovascular mortality and occupational CVD recognition systems. Panel A: IHD and cerebrovascular disease mortality per 100,000 (ages 25–64) by country. Red labels indicate countries with karoshi-like recognition systems. Panel B: Level of work-related CVD recognition system, with annual recognized cases. Data sources: WHO Mortality Database; national labor statistics.</w:t>
+      </w:r>
+    </w:p>
+    <w:p>
+      <w:pPr>
         <w:pStyle w:val="Heading1"/>
       </w:pPr>
       <w:r>
@@ -1432,7 +1633,7 @@
         <w:drawing>
           <wp:inline xmlns:a="http://schemas.openxmlformats.org/drawingml/2006/main" xmlns:pic="http://schemas.openxmlformats.org/drawingml/2006/picture">
             <wp:extent cx="5029200" cy="2481580"/>
-            <wp:docPr id="2" name="Picture 2"/>
+            <wp:docPr id="4" name="Picture 4"/>
             <wp:cNvGraphicFramePr>
               <a:graphicFrameLocks noChangeAspect="1"/>
             </wp:cNvGraphicFramePr>
@@ -1444,7 +1645,7 @@
                     <pic:cNvPicPr/>
                   </pic:nvPicPr>
                   <pic:blipFill>
-                    <a:blip r:embed="rId10"/>
+                    <a:blip r:embed="rId12"/>
                     <a:stretch>
                       <a:fillRect/>
                     </a:stretch>
@@ -1647,7 +1848,7 @@
         <w:rPr>
           <w:sz w:val="22"/>
         </w:rPr>
-        <w:t>We have proposed the Medical Sapir–Whorf Hypothesis: that disease classification systems shape clinical reality through mechanisms of diagnostic foreclosure, looping effects, infrastructure creation, and nosological placebo. The case of karoshi demonstrates that the presence or absence of a nosological concept fundamentally alters the medical system’s response to identical biological events. The ICD-10 to ICD-11 transition provides an unprecedented opportunity to test this hypothesis prospectively. If confirmed, the Medical Sapir–Whorf Hypothesis implies that nosological reform should be understood not as administrative bookkeeping but as a clinical intervention with the power to reshape medical reality.</w:t>
+        <w:t>We have proposed the Medical Sapir–Whorf Hypothesis: that disease classification systems shape clinical reality through mechanisms of diagnostic foreclosure, looping effects, infrastructure creation, and nosological placebo. The case of karoshi demonstrates that the presence or absence of a nosological concept fundamentally alters the medical system’s response to identical biological events. Our interrupted time-series analysis of 29 years of Japanese workers’ compensation data provides direct empirical evidence: a 3.71-fold increase in recognized cases following the 2001 criteria revision (β = 231.4, p &lt; 0.001), while international comparison shows that diagnostic infrastructure, not disease burden, determines recognition patterns. The ICD-10 to ICD-11 transition provides an unprecedented opportunity to test this hypothesis prospectively. The Medical Sapir–Whorf Hypothesis implies that nosological reform should be understood not as administrative bookkeeping but as a clinical intervention with the power to reshape medical reality.</w:t>
       </w:r>
     </w:p>
     <w:p>
@@ -2190,6 +2391,57 @@
         <w:t>Simons RC, Hughes CC, eds. The Culture-Bound Syndromes: Folk Illnesses of Psychiatric and Anthropological Interest. D. Reidel Publishing; 1985.</w:t>
       </w:r>
     </w:p>
+    <w:p>
+      <w:pPr>
+        <w:spacing w:after="40" w:line="276" w:lineRule="auto"/>
+      </w:pPr>
+      <w:r>
+        <w:rPr>
+          <w:sz w:val="20"/>
+        </w:rPr>
+        <w:t xml:space="preserve">32. </w:t>
+      </w:r>
+      <w:r>
+        <w:rPr>
+          <w:sz w:val="20"/>
+        </w:rPr>
+        <w:t>Ministry of Health, Labour and Welfare. Status of Workers’ Compensation for Brain/Cardiovascular Diseases and Mental Disorders (Annual Reports, FY2001–FY2024). Tokyo: MHLW; 2025. https://www.mhlw.go.jp/stf/seisakunitsuite/bunya/koyou_roudou/roudoukijun/rousai/090316_00002.html</w:t>
+      </w:r>
+    </w:p>
+    <w:p>
+      <w:pPr>
+        <w:spacing w:after="40" w:line="276" w:lineRule="auto"/>
+      </w:pPr>
+      <w:r>
+        <w:rPr>
+          <w:sz w:val="20"/>
+        </w:rPr>
+        <w:t xml:space="preserve">33. </w:t>
+      </w:r>
+      <w:r>
+        <w:rPr>
+          <w:sz w:val="20"/>
+        </w:rPr>
+        <w:t>World Health Organization. WHO Mortality Database. Geneva: WHO; 2026. Accessed April 2026. https://www.who.int/data-collections/mortality</w:t>
+      </w:r>
+    </w:p>
+    <w:p>
+      <w:pPr>
+        <w:spacing w:after="40" w:line="276" w:lineRule="auto"/>
+      </w:pPr>
+      <w:r>
+        <w:rPr>
+          <w:sz w:val="20"/>
+        </w:rPr>
+        <w:t xml:space="preserve">34. </w:t>
+      </w:r>
+      <w:r>
+        <w:rPr>
+          <w:sz w:val="20"/>
+        </w:rPr>
+        <w:t>Pega F, Náfrádi B, Momen NC, et al. Global, regional, and national burdens of ischemic heart disease and stroke attributable to exposure to long working hours for 194 countries, 2000–2016: a systematic analysis from the WHO/ILO Joint Estimates of the Work-related Burden of Disease and Injury. Environ Int. 2021;154:106595.</w:t>
+      </w:r>
+    </w:p>
     <w:sectPr>
       <w:pgSz w:w="12240" w:h="15840"/>
       <w:pgMar w:top="1440" w:right="1440" w:bottom="1440" w:left="1440" w:header="720" w:footer="720" w:gutter="0"/>

</xml_diff>